<commit_message>
docs(assessment): update step 1 local setup notes
</commit_message>
<xml_diff>
--- a/assessment/Step by step narrative.docx
+++ b/assessment/Step by step narrative.docx
@@ -799,16 +799,63 @@
     </w:p>
     <w:p>
       <w:pPr>
-        <w:rPr>
-          <w:b/>
-          <w:bCs/>
-        </w:rPr>
-      </w:pPr>
-      <w:r>
-        <w:rPr>
-          <w:b/>
-          <w:bCs/>
-        </w:rPr>
+        <w:numPr>
+          <w:ilvl w:val="0"/>
+          <w:numId w:val="3"/>
+        </w:numPr>
+      </w:pPr>
+      <w:r>
+        <w:t xml:space="preserve">I confirmed the background pipeline works end to end: POST /assessments returned </w:t>
+      </w:r>
+      <w:proofErr w:type="spellStart"/>
+      <w:r>
+        <w:t>system_prompt</w:t>
+      </w:r>
+      <w:proofErr w:type="spellEnd"/>
+      <w:r>
+        <w:t>: null, and a later GET /assessments/1 returned the compiled prompt (</w:t>
+      </w:r>
+      <w:proofErr w:type="spellStart"/>
+      <w:r>
+        <w:t>updated_at</w:t>
+      </w:r>
+      <w:proofErr w:type="spellEnd"/>
+      <w:r>
+        <w:t xml:space="preserve"> about 0.8s after </w:t>
+      </w:r>
+      <w:proofErr w:type="spellStart"/>
+      <w:r>
+        <w:t>created_at</w:t>
+      </w:r>
+      <w:proofErr w:type="spellEnd"/>
+      <w:r>
+        <w:t xml:space="preserve">), so the </w:t>
+      </w:r>
+      <w:proofErr w:type="spellStart"/>
+      <w:r>
+        <w:t>Sidekiq</w:t>
+      </w:r>
+      <w:proofErr w:type="spellEnd"/>
+      <w:r>
+        <w:t xml:space="preserve"> job ran.</w:t>
+      </w:r>
+    </w:p>
+    <w:p/>
+    <w:p/>
+    <w:p/>
+    <w:p>
+      <w:pPr>
+        <w:rPr>
+          <w:b/>
+          <w:bCs/>
+        </w:rPr>
+      </w:pPr>
+      <w:r>
+        <w:rPr>
+          <w:b/>
+          <w:bCs/>
+        </w:rPr>
+        <w:lastRenderedPageBreak/>
         <w:t>1.5 Baseline observations</w:t>
       </w:r>
     </w:p>
@@ -877,7 +924,6 @@
           <w:b/>
           <w:bCs/>
         </w:rPr>
-        <w:lastRenderedPageBreak/>
         <w:t>1.6 Early findings (to be ranked in Step 3)</w:t>
       </w:r>
     </w:p>
@@ -1268,7 +1314,11 @@
       </w:r>
       <w:proofErr w:type="gramEnd"/>
       <w:r>
-        <w:t xml:space="preserve"> The term '-H' is not recognized. I caught it because the command failed, read the error, and found that PowerShell uses a backtick for continuation and has trouble with nested escaped quotes. The fix was to put the JSON body in a file (</w:t>
+        <w:t xml:space="preserve"> The term '-H' is not recognized. I caught it because the command failed, read the error, and found that PowerShell uses a backtick for </w:t>
+      </w:r>
+      <w:r>
+        <w:lastRenderedPageBreak/>
+        <w:t>continuation and has trouble with nested escaped quotes. The fix was to put the JSON body in a file (</w:t>
       </w:r>
       <w:proofErr w:type="spellStart"/>
       <w:proofErr w:type="gramStart"/>
@@ -2634,6 +2684,7 @@
   <w:style w:type="character" w:default="1" w:styleId="DefaultParagraphFont">
     <w:name w:val="Default Paragraph Font"/>
     <w:uiPriority w:val="1"/>
+    <w:semiHidden/>
     <w:unhideWhenUsed/>
   </w:style>
   <w:style w:type="table" w:default="1" w:styleId="TableNormal">

</xml_diff>